<commit_message>
Update licence agreement template with Andy's latest formatting tweaks
Co-Authored-By: Claude Sonnet 5 <noreply@anthropic.com>
</commit_message>
<xml_diff>
--- a/public/license-agreement/template.docx
+++ b/public/license-agreement/template.docx
@@ -4091,58 +4091,16 @@
           <w:szCs w:val="22"/>
           <w:u w:val="single"/>
         </w:rPr>
-        <w:t xml:space="preserve">Again, make sure that you fully understand and agree to our </w:t>
-      </w:r>
-      <w:proofErr w:type="gramStart"/>
-      <w:r>
-        <w:rPr>
-          <w:rFonts w:asciiTheme="minorHAnsi" w:hAnsiTheme="minorHAnsi" w:cstheme="minorHAnsi"/>
-          <w:b/>
-          <w:sz w:val="22"/>
-          <w:szCs w:val="22"/>
-          <w:u w:val="single"/>
-        </w:rPr>
-        <w:t>Park</w:t>
-      </w:r>
-      <w:proofErr w:type="gramEnd"/>
-      <w:r>
-        <w:rPr>
-          <w:rFonts w:asciiTheme="minorHAnsi" w:hAnsiTheme="minorHAnsi" w:cstheme="minorHAnsi"/>
-          <w:b/>
-          <w:sz w:val="22"/>
-          <w:szCs w:val="22"/>
-          <w:u w:val="single"/>
-        </w:rPr>
-        <w:t xml:space="preserve"> Rules before you sign this Purchase Agreement.</w:t>
-      </w:r>
-      <w:r>
-        <w:rPr>
-          <w:rFonts w:asciiTheme="minorHAnsi" w:hAnsiTheme="minorHAnsi" w:cstheme="minorHAnsi"/>
-          <w:b/>
-          <w:sz w:val="22"/>
-          <w:szCs w:val="22"/>
-        </w:rPr>
-        <w:t xml:space="preserve"> Note also that the Licence Agreement allows us to make changes to the </w:t>
-      </w:r>
-      <w:proofErr w:type="gramStart"/>
-      <w:r>
-        <w:rPr>
-          <w:rFonts w:asciiTheme="minorHAnsi" w:hAnsiTheme="minorHAnsi" w:cstheme="minorHAnsi"/>
-          <w:b/>
-          <w:sz w:val="22"/>
-          <w:szCs w:val="22"/>
-        </w:rPr>
-        <w:t>Park</w:t>
-      </w:r>
-      <w:proofErr w:type="gramEnd"/>
-      <w:r>
-        <w:rPr>
-          <w:rFonts w:asciiTheme="minorHAnsi" w:hAnsiTheme="minorHAnsi" w:cstheme="minorHAnsi"/>
-          <w:b/>
-          <w:sz w:val="22"/>
-          <w:szCs w:val="22"/>
-        </w:rPr>
-        <w:t xml:space="preserve"> Rules.</w:t>
+        <w:t>Again, make sure that you fully understand and agree to our Park Rules before you sign this Purchase Agreement.</w:t>
+      </w:r>
+      <w:r>
+        <w:rPr>
+          <w:rFonts w:asciiTheme="minorHAnsi" w:hAnsiTheme="minorHAnsi" w:cstheme="minorHAnsi"/>
+          <w:b/>
+          <w:sz w:val="22"/>
+          <w:szCs w:val="22"/>
+        </w:rPr>
+        <w:t xml:space="preserve"> Note also that the Licence Agreement allows us to make changes to the Park Rules.</w:t>
       </w:r>
     </w:p>
     <w:p>
@@ -4409,43 +4367,7 @@
           <w:sz w:val="22"/>
           <w:szCs w:val="22"/>
         </w:rPr>
-        <w:t xml:space="preserve">If we're unable to collect any payment you owe </w:t>
-      </w:r>
-      <w:proofErr w:type="gramStart"/>
-      <w:r>
-        <w:rPr>
-          <w:rFonts w:asciiTheme="minorHAnsi" w:hAnsiTheme="minorHAnsi" w:cstheme="minorHAnsi"/>
-          <w:sz w:val="22"/>
-          <w:szCs w:val="22"/>
-        </w:rPr>
-        <w:t>us</w:t>
-      </w:r>
-      <w:proofErr w:type="gramEnd"/>
-      <w:r>
-        <w:rPr>
-          <w:rFonts w:asciiTheme="minorHAnsi" w:hAnsiTheme="minorHAnsi" w:cstheme="minorHAnsi"/>
-          <w:sz w:val="22"/>
-          <w:szCs w:val="22"/>
-        </w:rPr>
-        <w:t xml:space="preserve"> we charge interest on the overdue amount at the rate of 3% a year above the Barclays Bank PLC base rate from time to time. This interest accrues </w:t>
-      </w:r>
-      <w:proofErr w:type="gramStart"/>
-      <w:r>
-        <w:rPr>
-          <w:rFonts w:asciiTheme="minorHAnsi" w:hAnsiTheme="minorHAnsi" w:cstheme="minorHAnsi"/>
-          <w:sz w:val="22"/>
-          <w:szCs w:val="22"/>
-        </w:rPr>
-        <w:t>on a daily basis</w:t>
-      </w:r>
-      <w:proofErr w:type="gramEnd"/>
-      <w:r>
-        <w:rPr>
-          <w:rFonts w:asciiTheme="minorHAnsi" w:hAnsiTheme="minorHAnsi" w:cstheme="minorHAnsi"/>
-          <w:sz w:val="22"/>
-          <w:szCs w:val="22"/>
-        </w:rPr>
-        <w:t xml:space="preserve"> from the due date until the date of actual payment of the overdue amount, whether before or after judgment. You pay us the interest together with any overdue amount.</w:t>
+        <w:t>If we're unable to collect any payment you owe us we charge interest on the overdue amount at the rate of 3% a year above the Barclays Bank PLC base rate from time to time. This interest accrues on a daily basis from the due date until the date of actual payment of the overdue amount, whether before or after judgment. You pay us the interest together with any overdue amount.</w:t>
       </w:r>
     </w:p>
     <w:p>
@@ -4535,25 +4457,7 @@
           <w:sz w:val="22"/>
           <w:szCs w:val="22"/>
         </w:rPr>
-        <w:t xml:space="preserve">If our supply of your Holiday Caravan is delayed by an event outside our control, we will contact you as soon as possible to let you know and do what we can to reduce the delay. </w:t>
-      </w:r>
-      <w:proofErr w:type="gramStart"/>
-      <w:r>
-        <w:rPr>
-          <w:rFonts w:asciiTheme="minorHAnsi" w:hAnsiTheme="minorHAnsi" w:cstheme="minorHAnsi"/>
-          <w:sz w:val="22"/>
-          <w:szCs w:val="22"/>
-        </w:rPr>
-        <w:t>As long as</w:t>
-      </w:r>
-      <w:proofErr w:type="gramEnd"/>
-      <w:r>
-        <w:rPr>
-          <w:rFonts w:asciiTheme="minorHAnsi" w:hAnsiTheme="minorHAnsi" w:cstheme="minorHAnsi"/>
-          <w:sz w:val="22"/>
-          <w:szCs w:val="22"/>
-        </w:rPr>
-        <w:t xml:space="preserve"> we do this, we won't compensate you for the delay. We explain below when you may cancel.</w:t>
+        <w:t>If our supply of your Holiday Caravan is delayed by an event outside our control, we will contact you as soon as possible to let you know and do what we can to reduce the delay. As long as we do this, we won't compensate you for the delay. We explain below when you may cancel.</w:t>
       </w:r>
     </w:p>
     <w:p>
@@ -5265,25 +5169,7 @@
           <w:sz w:val="22"/>
           <w:szCs w:val="22"/>
         </w:rPr>
-        <w:t xml:space="preserve">We contact you in advance to tell you we're suspending supply, unless the problem is urgent or an emergency. If we suspend supply, or tell you we're going to suspend supply, for more than 3 months, or if we change the </w:t>
-      </w:r>
-      <w:proofErr w:type="gramStart"/>
-      <w:r>
-        <w:rPr>
-          <w:rFonts w:asciiTheme="minorHAnsi" w:hAnsiTheme="minorHAnsi" w:cstheme="minorHAnsi"/>
-          <w:sz w:val="22"/>
-          <w:szCs w:val="22"/>
-        </w:rPr>
-        <w:t>price</w:t>
-      </w:r>
-      <w:proofErr w:type="gramEnd"/>
-      <w:r>
-        <w:rPr>
-          <w:rFonts w:asciiTheme="minorHAnsi" w:hAnsiTheme="minorHAnsi" w:cstheme="minorHAnsi"/>
-          <w:sz w:val="22"/>
-          <w:szCs w:val="22"/>
-        </w:rPr>
-        <w:t xml:space="preserve"> you can contact us to end the Agreement, and we'll refund any sums you've paid in advance for the Holiday Caravan. </w:t>
+        <w:t xml:space="preserve">We contact you in advance to tell you we're suspending supply, unless the problem is urgent or an emergency. If we suspend supply, or tell you we're going to suspend supply, for more than 3 months, or if we change the price you can contact us to end the Agreement, and we'll refund any sums you've paid in advance for the Holiday Caravan. </w:t>
       </w:r>
     </w:p>
     <w:p>
@@ -5579,43 +5465,7 @@
           <w:sz w:val="22"/>
           <w:szCs w:val="22"/>
         </w:rPr>
-        <w:t xml:space="preserve">Caused by a delaying event outside our control. </w:t>
-      </w:r>
-      <w:proofErr w:type="gramStart"/>
-      <w:r>
-        <w:rPr>
-          <w:rFonts w:asciiTheme="minorHAnsi" w:hAnsiTheme="minorHAnsi" w:cstheme="minorHAnsi"/>
-          <w:sz w:val="22"/>
-          <w:szCs w:val="22"/>
-        </w:rPr>
-        <w:t>As long as</w:t>
-      </w:r>
-      <w:proofErr w:type="gramEnd"/>
-      <w:r>
-        <w:rPr>
-          <w:rFonts w:asciiTheme="minorHAnsi" w:hAnsiTheme="minorHAnsi" w:cstheme="minorHAnsi"/>
-          <w:sz w:val="22"/>
-          <w:szCs w:val="22"/>
-        </w:rPr>
-        <w:t xml:space="preserve"> we have taken any steps required by General Term </w:t>
-      </w:r>
-      <w:proofErr w:type="gramStart"/>
-      <w:r>
-        <w:rPr>
-          <w:rFonts w:asciiTheme="minorHAnsi" w:hAnsiTheme="minorHAnsi" w:cstheme="minorHAnsi"/>
-          <w:sz w:val="22"/>
-          <w:szCs w:val="22"/>
-        </w:rPr>
-        <w:t>16</w:t>
-      </w:r>
-      <w:proofErr w:type="gramEnd"/>
-      <w:r>
-        <w:rPr>
-          <w:rFonts w:asciiTheme="minorHAnsi" w:hAnsiTheme="minorHAnsi" w:cstheme="minorHAnsi"/>
-          <w:sz w:val="22"/>
-          <w:szCs w:val="22"/>
-        </w:rPr>
-        <w:t xml:space="preserve"> we're not responsible for delays outside our control. </w:t>
+        <w:t xml:space="preserve">Caused by a delaying event outside our control. As long as we have taken any steps required by General Term 16 we're not responsible for delays outside our control. </w:t>
       </w:r>
     </w:p>
     <w:p>
@@ -6425,7 +6275,6 @@
                 <w:szCs w:val="22"/>
               </w:rPr>
             </w:pPr>
-            <w:proofErr w:type="gramStart"/>
             <w:r>
               <w:rPr>
                 <w:rFonts w:asciiTheme="minorHAnsi" w:hAnsiTheme="minorHAnsi" w:cstheme="minorHAnsi"/>
@@ -6433,17 +6282,7 @@
                 <w:sz w:val="22"/>
                 <w:szCs w:val="22"/>
               </w:rPr>
-              <w:t>Signed:_</w:t>
-            </w:r>
-            <w:proofErr w:type="gramEnd"/>
-            <w:r>
-              <w:rPr>
-                <w:rFonts w:asciiTheme="minorHAnsi" w:hAnsiTheme="minorHAnsi" w:cstheme="minorHAnsi"/>
-                <w:i/>
-                <w:sz w:val="22"/>
-                <w:szCs w:val="22"/>
-              </w:rPr>
-              <w:t>____________________________________________</w:t>
+              <w:t>Signed:_____________________________________________</w:t>
             </w:r>
           </w:p>
           <w:p>
@@ -6580,7 +6419,6 @@
                 <w:szCs w:val="22"/>
               </w:rPr>
             </w:pPr>
-            <w:proofErr w:type="gramStart"/>
             <w:r>
               <w:rPr>
                 <w:rFonts w:asciiTheme="minorHAnsi" w:hAnsiTheme="minorHAnsi" w:cstheme="minorHAnsi"/>
@@ -6588,17 +6426,7 @@
                 <w:sz w:val="22"/>
                 <w:szCs w:val="22"/>
               </w:rPr>
-              <w:t>Signed:_</w:t>
-            </w:r>
-            <w:proofErr w:type="gramEnd"/>
-            <w:r>
-              <w:rPr>
-                <w:rFonts w:asciiTheme="minorHAnsi" w:hAnsiTheme="minorHAnsi" w:cstheme="minorHAnsi"/>
-                <w:i/>
-                <w:sz w:val="22"/>
-                <w:szCs w:val="22"/>
-              </w:rPr>
-              <w:t>____________________________________________</w:t>
+              <w:t>Signed:_____________________________________________</w:t>
             </w:r>
           </w:p>
           <w:p>
@@ -6964,7 +6792,6 @@
         <w:tab/>
         <w:t xml:space="preserve">Please tick here if you do not want us to use your personal data to contact you by electronic means (email or SMS) with information about goods and services </w:t>
       </w:r>
-      <w:proofErr w:type="gramStart"/>
       <w:r>
         <w:rPr>
           <w:rFonts w:asciiTheme="minorHAnsi" w:hAnsiTheme="minorHAnsi" w:cstheme="minorHAnsi"/>
@@ -6975,7 +6802,6 @@
         </w:rPr>
         <w:t>similar to</w:t>
       </w:r>
-      <w:proofErr w:type="gramEnd"/>
       <w:r>
         <w:rPr>
           <w:rFonts w:asciiTheme="minorHAnsi" w:hAnsiTheme="minorHAnsi" w:cstheme="minorHAnsi"/>
@@ -9057,27 +8883,7 @@
                 <w:sz w:val="22"/>
                 <w:szCs w:val="22"/>
               </w:rPr>
-              <w:t xml:space="preserve"> on the Pitch at the Park and use it for holidays when the Park is open, </w:t>
-            </w:r>
-            <w:proofErr w:type="gramStart"/>
-            <w:r>
-              <w:rPr>
-                <w:rFonts w:asciiTheme="minorHAnsi" w:hAnsiTheme="minorHAnsi" w:cstheme="minorHAnsi"/>
-                <w:color w:val="auto"/>
-                <w:sz w:val="22"/>
-                <w:szCs w:val="22"/>
-              </w:rPr>
-              <w:t>as long as</w:t>
-            </w:r>
-            <w:proofErr w:type="gramEnd"/>
-            <w:r>
-              <w:rPr>
-                <w:rFonts w:asciiTheme="minorHAnsi" w:hAnsiTheme="minorHAnsi" w:cstheme="minorHAnsi"/>
-                <w:color w:val="auto"/>
-                <w:sz w:val="22"/>
-                <w:szCs w:val="22"/>
-              </w:rPr>
-              <w:t xml:space="preserve"> you follow this Licence Agreement.</w:t>
+              <w:t xml:space="preserve"> on the Pitch at the Park and use it for holidays when the Park is open, as long as you follow this Licence Agreement.</w:t>
             </w:r>
           </w:p>
           <w:p>
@@ -9117,16 +8923,7 @@
                 <w:sz w:val="22"/>
                 <w:szCs w:val="22"/>
               </w:rPr>
-              <w:t xml:space="preserve"> just because we are open. It is for holidays </w:t>
-            </w:r>
-            <w:proofErr w:type="gramStart"/>
-            <w:r>
-              <w:rPr>
-                <w:rFonts w:asciiTheme="minorHAnsi" w:hAnsiTheme="minorHAnsi" w:cstheme="minorHAnsi"/>
-                <w:sz w:val="22"/>
-                <w:szCs w:val="22"/>
-              </w:rPr>
-              <w:t>only.</w:t>
+              <w:t xml:space="preserve"> just because we are open. It is for holidays only.</w:t>
             </w:r>
             <w:r>
               <w:rPr>
@@ -9137,7 +8934,6 @@
               </w:rPr>
               <w:t>*</w:t>
             </w:r>
-            <w:proofErr w:type="gramEnd"/>
           </w:p>
         </w:tc>
       </w:tr>
@@ -11137,25 +10933,7 @@
                 <w:sz w:val="22"/>
                 <w:szCs w:val="22"/>
               </w:rPr>
-              <w:t xml:space="preserve"> is the part of the </w:t>
-            </w:r>
-            <w:proofErr w:type="gramStart"/>
-            <w:r>
-              <w:rPr>
-                <w:rFonts w:asciiTheme="minorHAnsi" w:hAnsiTheme="minorHAnsi" w:cstheme="minorHAnsi"/>
-                <w:sz w:val="22"/>
-                <w:szCs w:val="22"/>
-              </w:rPr>
-              <w:t>Park</w:t>
-            </w:r>
-            <w:proofErr w:type="gramEnd"/>
-            <w:r>
-              <w:rPr>
-                <w:rFonts w:asciiTheme="minorHAnsi" w:hAnsiTheme="minorHAnsi" w:cstheme="minorHAnsi"/>
-                <w:sz w:val="22"/>
-                <w:szCs w:val="22"/>
-              </w:rPr>
-              <w:t xml:space="preserve"> on which </w:t>
+              <w:t xml:space="preserve"> is the part of the Park on which </w:t>
             </w:r>
             <w:r>
               <w:rPr>
@@ -11857,21 +11635,7 @@
               <w:rPr>
                 <w:rFonts w:asciiTheme="minorHAnsi" w:hAnsiTheme="minorHAnsi" w:cstheme="minorHAnsi"/>
               </w:rPr>
-              <w:t xml:space="preserve">been </w:t>
-            </w:r>
-            <w:proofErr w:type="gramStart"/>
-            <w:r>
-              <w:rPr>
-                <w:rFonts w:asciiTheme="minorHAnsi" w:hAnsiTheme="minorHAnsi" w:cstheme="minorHAnsi"/>
-              </w:rPr>
-              <w:t>taken into account</w:t>
-            </w:r>
-            <w:proofErr w:type="gramEnd"/>
-            <w:r>
-              <w:rPr>
-                <w:rFonts w:asciiTheme="minorHAnsi" w:hAnsiTheme="minorHAnsi" w:cstheme="minorHAnsi"/>
-              </w:rPr>
-              <w:t xml:space="preserve"> </w:t>
+              <w:t xml:space="preserve">been taken into account </w:t>
             </w:r>
             <w:r>
               <w:rPr>
@@ -11971,6 +11735,7 @@
                 <w:sz w:val="22"/>
                 <w:szCs w:val="22"/>
               </w:rPr>
+              <w:lastRenderedPageBreak/>
               <w:t>Insurance Check Fee</w:t>
             </w:r>
           </w:p>
@@ -12292,18 +12057,8 @@
                 <w:sz w:val="22"/>
                 <w:szCs w:val="22"/>
               </w:rPr>
-              <w:t xml:space="preserve"> to another part of the </w:t>
-            </w:r>
-            <w:proofErr w:type="gramStart"/>
-            <w:r>
-              <w:rPr>
-                <w:rFonts w:asciiTheme="minorHAnsi" w:hAnsiTheme="minorHAnsi" w:cstheme="minorHAnsi"/>
-                <w:sz w:val="22"/>
-                <w:szCs w:val="22"/>
-              </w:rPr>
-              <w:t>Park</w:t>
-            </w:r>
-            <w:proofErr w:type="gramEnd"/>
+              <w:t xml:space="preserve"> to another part of the Park</w:t>
+            </w:r>
             <w:r>
               <w:rPr>
                 <w:rFonts w:asciiTheme="minorHAnsi" w:hAnsiTheme="minorHAnsi" w:cstheme="minorHAnsi"/>
@@ -12564,23 +12319,13 @@
               </w:rPr>
               <w:t xml:space="preserve">, </w:t>
             </w:r>
-            <w:proofErr w:type="gramStart"/>
-            <w:r>
-              <w:rPr>
-                <w:rFonts w:asciiTheme="minorHAnsi" w:hAnsiTheme="minorHAnsi" w:cstheme="minorHAnsi"/>
-                <w:sz w:val="22"/>
-                <w:szCs w:val="22"/>
-              </w:rPr>
-              <w:t>similar to</w:t>
-            </w:r>
-            <w:proofErr w:type="gramEnd"/>
-            <w:r>
-              <w:rPr>
-                <w:rFonts w:asciiTheme="minorHAnsi" w:hAnsiTheme="minorHAnsi" w:cstheme="minorHAnsi"/>
-                <w:sz w:val="22"/>
-                <w:szCs w:val="22"/>
-              </w:rPr>
-              <w:t xml:space="preserve"> </w:t>
+            <w:r>
+              <w:rPr>
+                <w:rFonts w:asciiTheme="minorHAnsi" w:hAnsiTheme="minorHAnsi" w:cstheme="minorHAnsi"/>
+                <w:sz w:val="22"/>
+                <w:szCs w:val="22"/>
+              </w:rPr>
+              <w:t xml:space="preserve">similar to </w:t>
             </w:r>
             <w:r>
               <w:rPr>
@@ -13214,7 +12959,6 @@
               </w:rPr>
               <w:t xml:space="preserve">fully </w:t>
             </w:r>
-            <w:proofErr w:type="gramStart"/>
             <w:r>
               <w:rPr>
                 <w:rFonts w:asciiTheme="minorHAnsi" w:hAnsiTheme="minorHAnsi" w:cstheme="minorHAnsi"/>
@@ -13222,17 +12966,7 @@
                 <w:sz w:val="22"/>
                 <w:szCs w:val="22"/>
               </w:rPr>
-              <w:t>taken into account</w:t>
-            </w:r>
-            <w:proofErr w:type="gramEnd"/>
-            <w:r>
-              <w:rPr>
-                <w:rFonts w:asciiTheme="minorHAnsi" w:hAnsiTheme="minorHAnsi" w:cstheme="minorHAnsi"/>
-                <w:bCs/>
-                <w:sz w:val="22"/>
-                <w:szCs w:val="22"/>
-              </w:rPr>
-              <w:t xml:space="preserve"> previous</w:t>
+              <w:t>taken into account previous</w:t>
             </w:r>
             <w:r>
               <w:rPr>
@@ -13614,21 +13348,7 @@
               <w:rPr>
                 <w:rFonts w:asciiTheme="minorHAnsi" w:hAnsiTheme="minorHAnsi" w:cstheme="minorHAnsi"/>
               </w:rPr>
-              <w:t xml:space="preserve">Money we’ve spent for the benefit of holiday caravan owners on the </w:t>
-            </w:r>
-            <w:proofErr w:type="gramStart"/>
-            <w:r>
-              <w:rPr>
-                <w:rFonts w:asciiTheme="minorHAnsi" w:hAnsiTheme="minorHAnsi" w:cstheme="minorHAnsi"/>
-              </w:rPr>
-              <w:t>Park</w:t>
-            </w:r>
-            <w:proofErr w:type="gramEnd"/>
-            <w:r>
-              <w:rPr>
-                <w:rFonts w:asciiTheme="minorHAnsi" w:hAnsiTheme="minorHAnsi" w:cstheme="minorHAnsi"/>
-              </w:rPr>
-              <w:t xml:space="preserve">, and any Pitch Services and Park Facilities. </w:t>
+              <w:t xml:space="preserve">Money we’ve spent for the benefit of holiday caravan owners on the Park, and any Pitch Services and Park Facilities. </w:t>
             </w:r>
           </w:p>
           <w:p>
@@ -15218,25 +14938,7 @@
                 <w:sz w:val="22"/>
                 <w:szCs w:val="22"/>
               </w:rPr>
-              <w:t xml:space="preserve">greement ends you only need to pay at the rate of the Last Pitch </w:t>
-            </w:r>
-            <w:proofErr w:type="gramStart"/>
-            <w:r>
-              <w:rPr>
-                <w:rFonts w:asciiTheme="minorHAnsi" w:hAnsiTheme="minorHAnsi" w:cstheme="minorHAnsi"/>
-                <w:sz w:val="22"/>
-                <w:szCs w:val="22"/>
-              </w:rPr>
-              <w:t>Fee</w:t>
-            </w:r>
-            <w:proofErr w:type="gramEnd"/>
-            <w:r>
-              <w:rPr>
-                <w:rFonts w:asciiTheme="minorHAnsi" w:hAnsiTheme="minorHAnsi" w:cstheme="minorHAnsi"/>
-                <w:sz w:val="22"/>
-                <w:szCs w:val="22"/>
-              </w:rPr>
-              <w:t xml:space="preserve"> and we will reimburse any excess payment. </w:t>
+              <w:t xml:space="preserve">greement ends you only need to pay at the rate of the Last Pitch Fee and we will reimburse any excess payment. </w:t>
             </w:r>
             <w:r>
               <w:rPr>
@@ -16791,21 +16493,7 @@
               <w:rPr>
                 <w:rFonts w:asciiTheme="minorHAnsi" w:hAnsiTheme="minorHAnsi" w:cstheme="minorHAnsi"/>
               </w:rPr>
-              <w:t xml:space="preserve">The transaction must be handled by </w:t>
-            </w:r>
-            <w:proofErr w:type="gramStart"/>
-            <w:r>
-              <w:rPr>
-                <w:rFonts w:asciiTheme="minorHAnsi" w:hAnsiTheme="minorHAnsi" w:cstheme="minorHAnsi"/>
-              </w:rPr>
-              <w:t>us</w:t>
-            </w:r>
-            <w:proofErr w:type="gramEnd"/>
-            <w:r>
-              <w:rPr>
-                <w:rFonts w:asciiTheme="minorHAnsi" w:hAnsiTheme="minorHAnsi" w:cstheme="minorHAnsi"/>
-              </w:rPr>
-              <w:t xml:space="preserve"> and you appoint us to act for you. We will receive all payments from your buyer and pay you within five Working Days of receiving cleared funds. We will first pay off any finance you have notified us about in writing and deduct any Transfer Fee, VAT</w:t>
+              <w:t>The transaction must be handled by us and you appoint us to act for you. We will receive all payments from your buyer and pay you within five Working Days of receiving cleared funds. We will first pay off any finance you have notified us about in writing and deduct any Transfer Fee, VAT</w:t>
             </w:r>
             <w:r>
               <w:rPr>
@@ -16973,6 +16661,7 @@
                 <w:sz w:val="22"/>
                 <w:szCs w:val="22"/>
               </w:rPr>
+              <w:lastRenderedPageBreak/>
               <w:t xml:space="preserve">Giving </w:t>
             </w:r>
             <w:r>
@@ -17041,27 +16730,7 @@
                 <w:sz w:val="22"/>
                 <w:szCs w:val="22"/>
               </w:rPr>
-              <w:t xml:space="preserve"> to a Family Member or they inherit it after your death, they can ask us for an agreement to keep it on the </w:t>
-            </w:r>
-            <w:proofErr w:type="gramStart"/>
-            <w:r>
-              <w:rPr>
-                <w:rFonts w:asciiTheme="minorHAnsi" w:hAnsiTheme="minorHAnsi" w:cstheme="minorHAnsi"/>
-                <w:bCs/>
-                <w:sz w:val="22"/>
-                <w:szCs w:val="22"/>
-              </w:rPr>
-              <w:t>Park</w:t>
-            </w:r>
-            <w:proofErr w:type="gramEnd"/>
-            <w:r>
-              <w:rPr>
-                <w:rFonts w:asciiTheme="minorHAnsi" w:hAnsiTheme="minorHAnsi" w:cstheme="minorHAnsi"/>
-                <w:bCs/>
-                <w:sz w:val="22"/>
-                <w:szCs w:val="22"/>
-              </w:rPr>
-              <w:t xml:space="preserve">. We will ask the same questions as if you were selling </w:t>
+              <w:t xml:space="preserve"> to a Family Member or they inherit it after your death, they can ask us for an agreement to keep it on the Park. We will ask the same questions as if you were selling </w:t>
             </w:r>
             <w:r>
               <w:rPr>
@@ -17481,25 +17150,7 @@
                 <w:sz w:val="22"/>
                 <w:szCs w:val="22"/>
               </w:rPr>
-              <w:t xml:space="preserve">Your share is the total of these charges for the </w:t>
-            </w:r>
-            <w:proofErr w:type="gramStart"/>
-            <w:r>
-              <w:rPr>
-                <w:rFonts w:asciiTheme="minorHAnsi" w:hAnsiTheme="minorHAnsi" w:cstheme="minorHAnsi"/>
-                <w:sz w:val="22"/>
-                <w:szCs w:val="22"/>
-              </w:rPr>
-              <w:t>Park</w:t>
-            </w:r>
-            <w:proofErr w:type="gramEnd"/>
-            <w:r>
-              <w:rPr>
-                <w:rFonts w:asciiTheme="minorHAnsi" w:hAnsiTheme="minorHAnsi" w:cstheme="minorHAnsi"/>
-                <w:sz w:val="22"/>
-                <w:szCs w:val="22"/>
-              </w:rPr>
-              <w:t xml:space="preserve"> for the previous Rates Year</w:t>
+              <w:t>Your share is the total of these charges for the Park for the previous Rates Year</w:t>
             </w:r>
             <w:r>
               <w:rPr>
@@ -17639,18 +17290,8 @@
                 <w:sz w:val="22"/>
                 <w:szCs w:val="22"/>
               </w:rPr>
-              <w:t xml:space="preserve">authority </w:t>
-            </w:r>
-            <w:proofErr w:type="gramStart"/>
-            <w:r>
-              <w:rPr>
-                <w:rFonts w:asciiTheme="minorHAnsi" w:hAnsiTheme="minorHAnsi" w:cstheme="minorHAnsi"/>
-                <w:sz w:val="22"/>
-                <w:szCs w:val="22"/>
-              </w:rPr>
-              <w:t>changes</w:t>
-            </w:r>
-            <w:proofErr w:type="gramEnd"/>
+              <w:t>authority changes</w:t>
+            </w:r>
             <w:r>
               <w:rPr>
                 <w:rFonts w:asciiTheme="minorHAnsi" w:hAnsiTheme="minorHAnsi" w:cstheme="minorHAnsi"/>
@@ -19086,6 +18727,47 @@
                 </w:rPr>
                 <w:id w:val="-1317949022"/>
                 <w14:checkbox>
+                  <w14:checked w14:val="0"/>
+                  <w14:checkedState w14:val="0052" w14:font="Wingdings 2"/>
+                  <w14:uncheckedState w14:val="2610" w14:font="MS Gothic"/>
+                </w14:checkbox>
+              </w:sdtPr>
+              <w:sdtEndPr/>
+              <w:sdtContent>
+                <w:r>
+                  <w:rPr>
+                    <w:rFonts w:ascii="MS Gothic" w:eastAsia="MS Gothic" w:hAnsi="MS Gothic" w:cstheme="minorHAnsi" w:hint="eastAsia"/>
+                    <w:sz w:val="22"/>
+                    <w:szCs w:val="22"/>
+                  </w:rPr>
+                  <w:t>☐</w:t>
+                </w:r>
+              </w:sdtContent>
+            </w:sdt>
+          </w:p>
+        </w:tc>
+        <w:tc>
+          <w:tcPr>
+            <w:tcW w:w="4111" w:type="dxa"/>
+          </w:tcPr>
+          <w:p>
+            <w:pPr>
+              <w:jc w:val="center"/>
+              <w:rPr>
+                <w:rFonts w:asciiTheme="minorHAnsi" w:hAnsiTheme="minorHAnsi" w:cstheme="minorHAnsi"/>
+                <w:sz w:val="22"/>
+                <w:szCs w:val="22"/>
+              </w:rPr>
+            </w:pPr>
+            <w:sdt>
+              <w:sdtPr>
+                <w:rPr>
+                  <w:rFonts w:asciiTheme="minorHAnsi" w:hAnsiTheme="minorHAnsi" w:cstheme="minorHAnsi"/>
+                  <w:sz w:val="22"/>
+                  <w:szCs w:val="22"/>
+                </w:rPr>
+                <w:id w:val="1800178981"/>
+                <w14:checkbox>
                   <w14:checked w14:val="1"/>
                   <w14:checkedState w14:val="0052" w14:font="Wingdings 2"/>
                   <w14:uncheckedState w14:val="2610" w14:font="MS Gothic"/>
@@ -19100,47 +18782,6 @@
                     <w:szCs w:val="22"/>
                   </w:rPr>
                   <w:sym w:font="Wingdings 2" w:char="F052"/>
-                </w:r>
-              </w:sdtContent>
-            </w:sdt>
-          </w:p>
-        </w:tc>
-        <w:tc>
-          <w:tcPr>
-            <w:tcW w:w="4111" w:type="dxa"/>
-          </w:tcPr>
-          <w:p>
-            <w:pPr>
-              <w:jc w:val="center"/>
-              <w:rPr>
-                <w:rFonts w:asciiTheme="minorHAnsi" w:hAnsiTheme="minorHAnsi" w:cstheme="minorHAnsi"/>
-                <w:sz w:val="22"/>
-                <w:szCs w:val="22"/>
-              </w:rPr>
-            </w:pPr>
-            <w:sdt>
-              <w:sdtPr>
-                <w:rPr>
-                  <w:rFonts w:asciiTheme="minorHAnsi" w:hAnsiTheme="minorHAnsi" w:cstheme="minorHAnsi"/>
-                  <w:sz w:val="22"/>
-                  <w:szCs w:val="22"/>
-                </w:rPr>
-                <w:id w:val="1800178981"/>
-                <w14:checkbox>
-                  <w14:checked w14:val="0"/>
-                  <w14:checkedState w14:val="0052" w14:font="Wingdings 2"/>
-                  <w14:uncheckedState w14:val="2610" w14:font="MS Gothic"/>
-                </w14:checkbox>
-              </w:sdtPr>
-              <w:sdtEndPr/>
-              <w:sdtContent>
-                <w:r>
-                  <w:rPr>
-                    <w:rFonts w:ascii="Segoe UI Symbol" w:eastAsia="MS Gothic" w:hAnsi="Segoe UI Symbol" w:cs="Segoe UI Symbol"/>
-                    <w:sz w:val="22"/>
-                    <w:szCs w:val="22"/>
-                  </w:rPr>
-                  <w:t>☐</w:t>
                 </w:r>
               </w:sdtContent>
             </w:sdt>

</xml_diff>

<commit_message>
Fix address typo and postcode in licence agreement template
Andy's address block read "HolywellFlintshire" (missing punctuation)
and the postcode was missing its "C" (H89JP instead of CH89JP).

Co-Authored-By: Claude Sonnet 5 <noreply@anthropic.com>
</commit_message>
<xml_diff>
--- a/public/license-agreement/template.docx
+++ b/public/license-agreement/template.docx
@@ -2227,24 +2227,24 @@
                 <w:sz w:val="22"/>
                 <w:szCs w:val="18"/>
               </w:rPr>
+              <w:t xml:space="preserve">We may offer to buy your Holiday Caravan back from you. However, we cannot promise to do so or guarantee our offer price because the market and our business needs change from time to time. </w:t>
+            </w:r>
+          </w:p>
+          <w:p>
+            <w:pPr>
+              <w:rPr>
+                <w:rFonts w:asciiTheme="minorHAnsi" w:hAnsiTheme="minorHAnsi" w:cstheme="minorHAnsi"/>
+                <w:sz w:val="22"/>
+                <w:szCs w:val="18"/>
+              </w:rPr>
+            </w:pPr>
+            <w:r>
+              <w:rPr>
+                <w:rFonts w:asciiTheme="minorHAnsi" w:hAnsiTheme="minorHAnsi" w:cstheme="minorHAnsi"/>
+                <w:sz w:val="22"/>
+                <w:szCs w:val="18"/>
+              </w:rPr>
               <w:lastRenderedPageBreak/>
-              <w:t xml:space="preserve">We may offer to buy your Holiday Caravan back from you. However, we cannot promise to do so or guarantee our offer price because the market and our business needs change from time to time. </w:t>
-            </w:r>
-          </w:p>
-          <w:p>
-            <w:pPr>
-              <w:rPr>
-                <w:rFonts w:asciiTheme="minorHAnsi" w:hAnsiTheme="minorHAnsi" w:cstheme="minorHAnsi"/>
-                <w:sz w:val="22"/>
-                <w:szCs w:val="18"/>
-              </w:rPr>
-            </w:pPr>
-            <w:r>
-              <w:rPr>
-                <w:rFonts w:asciiTheme="minorHAnsi" w:hAnsiTheme="minorHAnsi" w:cstheme="minorHAnsi"/>
-                <w:sz w:val="22"/>
-                <w:szCs w:val="18"/>
-              </w:rPr>
               <w:t> </w:t>
             </w:r>
           </w:p>
@@ -6772,7 +6772,6 @@
             <w14:uncheckedState w14:val="2610" w14:font="MS Gothic"/>
           </w14:checkbox>
         </w:sdtPr>
-        <w:sdtEndPr/>
         <w:sdtContent>
           <w:r>
             <w:rPr>
@@ -6897,7 +6896,6 @@
             <w14:uncheckedState w14:val="2610" w14:font="MS Gothic"/>
           </w14:checkbox>
         </w:sdtPr>
-        <w:sdtEndPr/>
         <w:sdtContent>
           <w:r>
             <w:rPr>
@@ -6945,7 +6943,6 @@
             <w14:uncheckedState w14:val="2610" w14:font="MS Gothic"/>
           </w14:checkbox>
         </w:sdtPr>
-        <w:sdtEndPr/>
         <w:sdtContent>
           <w:r>
             <w:rPr>
@@ -6993,7 +6990,6 @@
             <w14:uncheckedState w14:val="2610" w14:font="MS Gothic"/>
           </w14:checkbox>
         </w:sdtPr>
-        <w:sdtEndPr/>
         <w:sdtContent>
           <w:r>
             <w:rPr>
@@ -7094,12 +7090,7 @@
           <w:szCs w:val="22"/>
         </w:rPr>
         <w:sectPr>
-          <w:headerReference w:type="even" r:id="rId11"/>
-          <w:headerReference w:type="default" r:id="rId12"/>
-          <w:footerReference w:type="even" r:id="rId13"/>
-          <w:footerReference w:type="default" r:id="rId14"/>
-          <w:headerReference w:type="first" r:id="rId15"/>
-          <w:footerReference w:type="first" r:id="rId16"/>
+          <w:footerReference w:type="default" r:id="rId11"/>
           <w:pgSz w:w="11907" w:h="16840"/>
           <w:pgMar w:top="720" w:right="720" w:bottom="720" w:left="720" w:header="709" w:footer="0" w:gutter="0"/>
           <w:paperSrc w:first="258" w:other="257"/>
@@ -9184,27 +9175,25 @@
                 <w:sz w:val="22"/>
                 <w:szCs w:val="22"/>
               </w:rPr>
-              <w:t xml:space="preserve">Gwespyr, Nr </w:t>
-            </w:r>
-            <w:proofErr w:type="spellStart"/>
-            <w:r>
-              <w:rPr>
-                <w:rFonts w:asciiTheme="minorHAnsi" w:hAnsiTheme="minorHAnsi" w:cstheme="minorHAnsi"/>
-                <w:b/>
-                <w:sz w:val="22"/>
-                <w:szCs w:val="22"/>
-              </w:rPr>
-              <w:t>HolywellFlintshire</w:t>
-            </w:r>
-            <w:proofErr w:type="spellEnd"/>
-            <w:r>
-              <w:rPr>
-                <w:rFonts w:asciiTheme="minorHAnsi" w:hAnsiTheme="minorHAnsi" w:cstheme="minorHAnsi"/>
-                <w:b/>
-                <w:sz w:val="22"/>
-                <w:szCs w:val="22"/>
-              </w:rPr>
-              <w:t>, H89JP</w:t>
+              <w:t>Gwespyr, Nr Holywell</w:t>
+            </w:r>
+            <w:r>
+              <w:rPr>
+                <w:rFonts w:asciiTheme="minorHAnsi" w:hAnsiTheme="minorHAnsi" w:cstheme="minorHAnsi"/>
+                <w:b/>
+                <w:sz w:val="22"/>
+                <w:szCs w:val="22"/>
+              </w:rPr>
+              <w:t xml:space="preserve">, </w:t>
+            </w:r>
+            <w:r>
+              <w:rPr>
+                <w:rFonts w:asciiTheme="minorHAnsi" w:hAnsiTheme="minorHAnsi" w:cstheme="minorHAnsi"/>
+                <w:b/>
+                <w:sz w:val="22"/>
+                <w:szCs w:val="22"/>
+              </w:rPr>
+              <w:t>Flintshire, CH89JP</w:t>
             </w:r>
           </w:p>
         </w:tc>
@@ -18289,7 +18278,6 @@
                   <w14:uncheckedState w14:val="2610" w14:font="MS Gothic"/>
                 </w14:checkbox>
               </w:sdtPr>
-              <w:sdtEndPr/>
               <w:sdtContent>
                 <w:r>
                   <w:rPr>
@@ -18330,7 +18318,6 @@
                   <w14:uncheckedState w14:val="2610" w14:font="MS Gothic"/>
                 </w14:checkbox>
               </w:sdtPr>
-              <w:sdtEndPr/>
               <w:sdtContent>
                 <w:r>
                   <w:rPr>
@@ -18371,7 +18358,6 @@
                   <w14:uncheckedState w14:val="2610" w14:font="MS Gothic"/>
                 </w14:checkbox>
               </w:sdtPr>
-              <w:sdtEndPr/>
               <w:sdtContent>
                 <w:r>
                   <w:rPr>
@@ -18437,7 +18423,6 @@
                   <w14:uncheckedState w14:val="2610" w14:font="MS Gothic"/>
                 </w14:checkbox>
               </w:sdtPr>
-              <w:sdtEndPr/>
               <w:sdtContent>
                 <w:r>
                   <w:rPr>
@@ -18478,7 +18463,6 @@
                   <w14:uncheckedState w14:val="2610" w14:font="MS Gothic"/>
                 </w14:checkbox>
               </w:sdtPr>
-              <w:sdtEndPr/>
               <w:sdtContent>
                 <w:r>
                   <w:rPr>
@@ -18519,7 +18503,6 @@
                   <w14:uncheckedState w14:val="2610" w14:font="MS Gothic"/>
                 </w14:checkbox>
               </w:sdtPr>
-              <w:sdtEndPr/>
               <w:sdtContent>
                 <w:r>
                   <w:rPr>
@@ -18585,7 +18568,6 @@
                   <w14:uncheckedState w14:val="2610" w14:font="MS Gothic"/>
                 </w14:checkbox>
               </w:sdtPr>
-              <w:sdtEndPr/>
               <w:sdtContent>
                 <w:r>
                   <w:rPr>
@@ -18626,7 +18608,6 @@
                   <w14:uncheckedState w14:val="2610" w14:font="MS Gothic"/>
                 </w14:checkbox>
               </w:sdtPr>
-              <w:sdtEndPr/>
               <w:sdtContent>
                 <w:r>
                   <w:rPr>
@@ -18667,7 +18648,6 @@
                   <w14:uncheckedState w14:val="2610" w14:font="MS Gothic"/>
                 </w14:checkbox>
               </w:sdtPr>
-              <w:sdtEndPr/>
               <w:sdtContent>
                 <w:r>
                   <w:rPr>
@@ -18734,7 +18714,6 @@
                   <w14:uncheckedState w14:val="2610" w14:font="MS Gothic"/>
                 </w14:checkbox>
               </w:sdtPr>
-              <w:sdtEndPr/>
               <w:sdtContent>
                 <w:r>
                   <w:rPr>
@@ -18775,7 +18754,6 @@
                   <w14:uncheckedState w14:val="2610" w14:font="MS Gothic"/>
                 </w14:checkbox>
               </w:sdtPr>
-              <w:sdtEndPr/>
               <w:sdtContent>
                 <w:r>
                   <w:rPr>
@@ -18816,7 +18794,6 @@
                   <w14:uncheckedState w14:val="2610" w14:font="MS Gothic"/>
                 </w14:checkbox>
               </w:sdtPr>
-              <w:sdtEndPr/>
               <w:sdtContent>
                 <w:r>
                   <w:rPr>
@@ -18882,7 +18859,6 @@
                   <w14:uncheckedState w14:val="2610" w14:font="MS Gothic"/>
                 </w14:checkbox>
               </w:sdtPr>
-              <w:sdtEndPr/>
               <w:sdtContent>
                 <w:r>
                   <w:rPr>
@@ -18923,7 +18899,6 @@
                   <w14:uncheckedState w14:val="2610" w14:font="MS Gothic"/>
                 </w14:checkbox>
               </w:sdtPr>
-              <w:sdtEndPr/>
               <w:sdtContent>
                 <w:r>
                   <w:rPr>
@@ -18964,7 +18939,6 @@
                   <w14:uncheckedState w14:val="2610" w14:font="MS Gothic"/>
                 </w14:checkbox>
               </w:sdtPr>
-              <w:sdtEndPr/>
               <w:sdtContent>
                 <w:r>
                   <w:rPr>
@@ -19030,7 +19004,6 @@
                   <w14:uncheckedState w14:val="2610" w14:font="MS Gothic"/>
                 </w14:checkbox>
               </w:sdtPr>
-              <w:sdtEndPr/>
               <w:sdtContent>
                 <w:r>
                   <w:rPr>
@@ -19071,7 +19044,6 @@
                   <w14:uncheckedState w14:val="2610" w14:font="MS Gothic"/>
                 </w14:checkbox>
               </w:sdtPr>
-              <w:sdtEndPr/>
               <w:sdtContent>
                 <w:r>
                   <w:rPr>
@@ -19112,7 +19084,6 @@
                   <w14:uncheckedState w14:val="2610" w14:font="MS Gothic"/>
                 </w14:checkbox>
               </w:sdtPr>
-              <w:sdtEndPr/>
               <w:sdtContent>
                 <w:r>
                   <w:rPr>
@@ -19178,7 +19149,6 @@
                   <w14:uncheckedState w14:val="2610" w14:font="MS Gothic"/>
                 </w14:checkbox>
               </w:sdtPr>
-              <w:sdtEndPr/>
               <w:sdtContent>
                 <w:r>
                   <w:rPr>
@@ -19219,7 +19189,6 @@
                   <w14:uncheckedState w14:val="2610" w14:font="MS Gothic"/>
                 </w14:checkbox>
               </w:sdtPr>
-              <w:sdtEndPr/>
               <w:sdtContent>
                 <w:r>
                   <w:rPr>
@@ -19260,7 +19229,6 @@
                   <w14:uncheckedState w14:val="2610" w14:font="MS Gothic"/>
                 </w14:checkbox>
               </w:sdtPr>
-              <w:sdtEndPr/>
               <w:sdtContent>
                 <w:r>
                   <w:rPr>
@@ -27337,7 +27305,6 @@
             <w14:uncheckedState w14:val="2610" w14:font="MS Gothic"/>
           </w14:checkbox>
         </w:sdtPr>
-        <w:sdtEndPr/>
         <w:sdtContent>
           <w:r>
             <w:rPr>
@@ -27503,7 +27470,6 @@
             <w14:uncheckedState w14:val="2610" w14:font="MS Gothic"/>
           </w14:checkbox>
         </w:sdtPr>
-        <w:sdtEndPr/>
         <w:sdtContent>
           <w:r>
             <w:rPr>
@@ -27547,7 +27513,6 @@
             <w14:uncheckedState w14:val="2610" w14:font="MS Gothic"/>
           </w14:checkbox>
         </w:sdtPr>
-        <w:sdtEndPr/>
         <w:sdtContent>
           <w:r>
             <w:rPr>
@@ -27591,7 +27556,6 @@
             <w14:uncheckedState w14:val="2610" w14:font="MS Gothic"/>
           </w14:checkbox>
         </w:sdtPr>
-        <w:sdtEndPr/>
         <w:sdtContent>
           <w:r>
             <w:rPr>
@@ -27690,12 +27654,12 @@
       </w:r>
     </w:p>
     <w:sectPr>
-      <w:headerReference w:type="even" r:id="rId17"/>
-      <w:headerReference w:type="default" r:id="rId18"/>
-      <w:footerReference w:type="even" r:id="rId19"/>
-      <w:footerReference w:type="default" r:id="rId20"/>
-      <w:headerReference w:type="first" r:id="rId21"/>
-      <w:footerReference w:type="first" r:id="rId22"/>
+      <w:headerReference w:type="even" r:id="rId12"/>
+      <w:headerReference w:type="default" r:id="rId13"/>
+      <w:footerReference w:type="even" r:id="rId14"/>
+      <w:footerReference w:type="default" r:id="rId15"/>
+      <w:headerReference w:type="first" r:id="rId16"/>
+      <w:footerReference w:type="first" r:id="rId17"/>
       <w:pgSz w:w="11907" w:h="16840" w:code="9"/>
       <w:pgMar w:top="720" w:right="720" w:bottom="720" w:left="720" w:header="709" w:footer="0" w:gutter="0"/>
       <w:paperSrc w:first="257" w:other="257"/>
@@ -27728,16 +27692,6 @@
 </file>
 
 <file path=word/footer1.xml><?xml version="1.0" encoding="utf-8"?>
-<w:ftr xmlns:wpc="http://schemas.microsoft.com/office/word/2010/wordprocessingCanvas" xmlns:cx="http://schemas.microsoft.com/office/drawing/2014/chartex" xmlns:cx1="http://schemas.microsoft.com/office/drawing/2015/9/8/chartex" xmlns:cx2="http://schemas.microsoft.com/office/drawing/2015/10/21/chartex" xmlns:cx3="http://schemas.microsoft.com/office/drawing/2016/5/9/chartex" xmlns:cx4="http://schemas.microsoft.com/office/drawing/2016/5/10/chartex" xmlns:cx5="http://schemas.microsoft.com/office/drawing/2016/5/11/chartex" xmlns:cx6="http://schemas.microsoft.com/office/drawing/2016/5/12/chartex" xmlns:cx7="http://schemas.microsoft.com/office/drawing/2016/5/13/chartex" xmlns:cx8="http://schemas.microsoft.com/office/drawing/2016/5/14/chartex" xmlns:mc="http://schemas.openxmlformats.org/markup-compatibility/2006" xmlns:aink="http://schemas.microsoft.com/office/drawing/2016/ink" xmlns:am3d="http://schemas.microsoft.com/office/drawing/2017/model3d" xmlns:o="urn:schemas-microsoft-com:office:office" xmlns:oel="http://schemas.microsoft.com/office/2019/extlst" xmlns:r="http://schemas.openxmlformats.org/officeDocument/2006/relationships" xmlns:m="http://schemas.openxmlformats.org/officeDocument/2006/math" xmlns:v="urn:schemas-microsoft-com:vml" xmlns:wp14="http://schemas.microsoft.com/office/word/2010/wordprocessingDrawing" xmlns:wp="http://schemas.openxmlformats.org/drawingml/2006/wordprocessingDrawing" xmlns:w10="urn:schemas-microsoft-com:office:word" xmlns:w="http://schemas.openxmlformats.org/wordprocessingml/2006/main" xmlns:w14="http://schemas.microsoft.com/office/word/2010/wordml" xmlns:w15="http://schemas.microsoft.com/office/word/2012/wordml" xmlns:w16cex="http://schemas.microsoft.com/office/word/2018/wordml/cex" xmlns:w16cid="http://schemas.microsoft.com/office/word/2016/wordml/cid" xmlns:w16="http://schemas.microsoft.com/office/word/2018/wordml" xmlns:w16du="http://schemas.microsoft.com/office/word/2023/wordml/word16du" xmlns:w16sdtdh="http://schemas.microsoft.com/office/word/2020/wordml/sdtdatahash" xmlns:w16sdtfl="http://schemas.microsoft.com/office/word/2024/wordml/sdtformatlock" xmlns:w16se="http://schemas.microsoft.com/office/word/2015/wordml/symex" xmlns:wpg="http://schemas.microsoft.com/office/word/2010/wordprocessingGroup" xmlns:wpi="http://schemas.microsoft.com/office/word/2010/wordprocessingInk" xmlns:wne="http://schemas.microsoft.com/office/word/2006/wordml" xmlns:wps="http://schemas.microsoft.com/office/word/2010/wordprocessingShape" mc:Ignorable="w14 w15 w16se w16cid w16 w16cex w16sdtdh w16sdtfl w16du wp14">
-  <w:p>
-    <w:pPr>
-      <w:pStyle w:val="Footer"/>
-    </w:pPr>
-  </w:p>
-</w:ftr>
-</file>
-
-<file path=word/footer2.xml><?xml version="1.0" encoding="utf-8"?>
 <w:ftr xmlns:wpc="http://schemas.microsoft.com/office/word/2010/wordprocessingCanvas" xmlns:cx="http://schemas.microsoft.com/office/drawing/2014/chartex" xmlns:cx1="http://schemas.microsoft.com/office/drawing/2015/9/8/chartex" xmlns:cx2="http://schemas.microsoft.com/office/drawing/2015/10/21/chartex" xmlns:cx3="http://schemas.microsoft.com/office/drawing/2016/5/9/chartex" xmlns:cx4="http://schemas.microsoft.com/office/drawing/2016/5/10/chartex" xmlns:cx5="http://schemas.microsoft.com/office/drawing/2016/5/11/chartex" xmlns:cx6="http://schemas.microsoft.com/office/drawing/2016/5/12/chartex" xmlns:cx7="http://schemas.microsoft.com/office/drawing/2016/5/13/chartex" xmlns:cx8="http://schemas.microsoft.com/office/drawing/2016/5/14/chartex" xmlns:mc="http://schemas.openxmlformats.org/markup-compatibility/2006" xmlns:aink="http://schemas.microsoft.com/office/drawing/2016/ink" xmlns:am3d="http://schemas.microsoft.com/office/drawing/2017/model3d" xmlns:o="urn:schemas-microsoft-com:office:office" xmlns:oel="http://schemas.microsoft.com/office/2019/extlst" xmlns:r="http://schemas.openxmlformats.org/officeDocument/2006/relationships" xmlns:m="http://schemas.openxmlformats.org/officeDocument/2006/math" xmlns:v="urn:schemas-microsoft-com:vml" xmlns:wp14="http://schemas.microsoft.com/office/word/2010/wordprocessingDrawing" xmlns:wp="http://schemas.openxmlformats.org/drawingml/2006/wordprocessingDrawing" xmlns:w10="urn:schemas-microsoft-com:office:word" xmlns:w="http://schemas.openxmlformats.org/wordprocessingml/2006/main" xmlns:w14="http://schemas.microsoft.com/office/word/2010/wordml" xmlns:w15="http://schemas.microsoft.com/office/word/2012/wordml" xmlns:w16cex="http://schemas.microsoft.com/office/word/2018/wordml/cex" xmlns:w16cid="http://schemas.microsoft.com/office/word/2016/wordml/cid" xmlns:w16="http://schemas.microsoft.com/office/word/2018/wordml" xmlns:w16du="http://schemas.microsoft.com/office/word/2023/wordml/word16du" xmlns:w16sdtdh="http://schemas.microsoft.com/office/word/2020/wordml/sdtdatahash" xmlns:w16sdtfl="http://schemas.microsoft.com/office/word/2024/wordml/sdtformatlock" xmlns:w16se="http://schemas.microsoft.com/office/word/2015/wordml/symex" xmlns:wpg="http://schemas.microsoft.com/office/word/2010/wordprocessingGroup" xmlns:wpi="http://schemas.microsoft.com/office/word/2010/wordprocessingInk" xmlns:wne="http://schemas.microsoft.com/office/word/2006/wordml" xmlns:wps="http://schemas.microsoft.com/office/word/2010/wordprocessingShape" mc:Ignorable="w14 w15 w16se w16cid w16 w16cex w16sdtdh w16sdtfl w16du wp14">
   <w:tbl>
     <w:tblPr>
@@ -27895,17 +27849,7 @@
 </w:ftr>
 </file>
 
-<file path=word/footer3.xml><?xml version="1.0" encoding="utf-8"?>
-<w:ftr xmlns:wpc="http://schemas.microsoft.com/office/word/2010/wordprocessingCanvas" xmlns:cx="http://schemas.microsoft.com/office/drawing/2014/chartex" xmlns:cx1="http://schemas.microsoft.com/office/drawing/2015/9/8/chartex" xmlns:cx2="http://schemas.microsoft.com/office/drawing/2015/10/21/chartex" xmlns:cx3="http://schemas.microsoft.com/office/drawing/2016/5/9/chartex" xmlns:cx4="http://schemas.microsoft.com/office/drawing/2016/5/10/chartex" xmlns:cx5="http://schemas.microsoft.com/office/drawing/2016/5/11/chartex" xmlns:cx6="http://schemas.microsoft.com/office/drawing/2016/5/12/chartex" xmlns:cx7="http://schemas.microsoft.com/office/drawing/2016/5/13/chartex" xmlns:cx8="http://schemas.microsoft.com/office/drawing/2016/5/14/chartex" xmlns:mc="http://schemas.openxmlformats.org/markup-compatibility/2006" xmlns:aink="http://schemas.microsoft.com/office/drawing/2016/ink" xmlns:am3d="http://schemas.microsoft.com/office/drawing/2017/model3d" xmlns:o="urn:schemas-microsoft-com:office:office" xmlns:oel="http://schemas.microsoft.com/office/2019/extlst" xmlns:r="http://schemas.openxmlformats.org/officeDocument/2006/relationships" xmlns:m="http://schemas.openxmlformats.org/officeDocument/2006/math" xmlns:v="urn:schemas-microsoft-com:vml" xmlns:wp14="http://schemas.microsoft.com/office/word/2010/wordprocessingDrawing" xmlns:wp="http://schemas.openxmlformats.org/drawingml/2006/wordprocessingDrawing" xmlns:w10="urn:schemas-microsoft-com:office:word" xmlns:w="http://schemas.openxmlformats.org/wordprocessingml/2006/main" xmlns:w14="http://schemas.microsoft.com/office/word/2010/wordml" xmlns:w15="http://schemas.microsoft.com/office/word/2012/wordml" xmlns:w16cex="http://schemas.microsoft.com/office/word/2018/wordml/cex" xmlns:w16cid="http://schemas.microsoft.com/office/word/2016/wordml/cid" xmlns:w16="http://schemas.microsoft.com/office/word/2018/wordml" xmlns:w16du="http://schemas.microsoft.com/office/word/2023/wordml/word16du" xmlns:w16sdtdh="http://schemas.microsoft.com/office/word/2020/wordml/sdtdatahash" xmlns:w16sdtfl="http://schemas.microsoft.com/office/word/2024/wordml/sdtformatlock" xmlns:w16se="http://schemas.microsoft.com/office/word/2015/wordml/symex" xmlns:wpg="http://schemas.microsoft.com/office/word/2010/wordprocessingGroup" xmlns:wpi="http://schemas.microsoft.com/office/word/2010/wordprocessingInk" xmlns:wne="http://schemas.microsoft.com/office/word/2006/wordml" xmlns:wps="http://schemas.microsoft.com/office/word/2010/wordprocessingShape" mc:Ignorable="w14 w15 w16se w16cid w16 w16cex w16sdtdh w16sdtfl w16du wp14">
-  <w:p>
-    <w:pPr>
-      <w:pStyle w:val="Footer"/>
-    </w:pPr>
-  </w:p>
-</w:ftr>
-</file>
-
-<file path=word/footer4.xml><?xml version="1.0" encoding="utf-8"?>
+<file path=word/footer2.xml><?xml version="1.0" encoding="utf-8"?>
 <w:ftr xmlns:wpc="http://schemas.microsoft.com/office/word/2010/wordprocessingCanvas" xmlns:cx="http://schemas.microsoft.com/office/drawing/2014/chartex" xmlns:cx1="http://schemas.microsoft.com/office/drawing/2015/9/8/chartex" xmlns:cx2="http://schemas.microsoft.com/office/drawing/2015/10/21/chartex" xmlns:cx3="http://schemas.microsoft.com/office/drawing/2016/5/9/chartex" xmlns:cx4="http://schemas.microsoft.com/office/drawing/2016/5/10/chartex" xmlns:cx5="http://schemas.microsoft.com/office/drawing/2016/5/11/chartex" xmlns:cx6="http://schemas.microsoft.com/office/drawing/2016/5/12/chartex" xmlns:cx7="http://schemas.microsoft.com/office/drawing/2016/5/13/chartex" xmlns:cx8="http://schemas.microsoft.com/office/drawing/2016/5/14/chartex" xmlns:mc="http://schemas.openxmlformats.org/markup-compatibility/2006" xmlns:aink="http://schemas.microsoft.com/office/drawing/2016/ink" xmlns:am3d="http://schemas.microsoft.com/office/drawing/2017/model3d" xmlns:o="urn:schemas-microsoft-com:office:office" xmlns:oel="http://schemas.microsoft.com/office/2019/extlst" xmlns:r="http://schemas.openxmlformats.org/officeDocument/2006/relationships" xmlns:m="http://schemas.openxmlformats.org/officeDocument/2006/math" xmlns:v="urn:schemas-microsoft-com:vml" xmlns:wp14="http://schemas.microsoft.com/office/word/2010/wordprocessingDrawing" xmlns:wp="http://schemas.openxmlformats.org/drawingml/2006/wordprocessingDrawing" xmlns:w10="urn:schemas-microsoft-com:office:word" xmlns:w="http://schemas.openxmlformats.org/wordprocessingml/2006/main" xmlns:w14="http://schemas.microsoft.com/office/word/2010/wordml" xmlns:w15="http://schemas.microsoft.com/office/word/2012/wordml" xmlns:w16cex="http://schemas.microsoft.com/office/word/2018/wordml/cex" xmlns:w16cid="http://schemas.microsoft.com/office/word/2016/wordml/cid" xmlns:w16="http://schemas.microsoft.com/office/word/2018/wordml" xmlns:w16du="http://schemas.microsoft.com/office/word/2023/wordml/word16du" xmlns:w16sdtdh="http://schemas.microsoft.com/office/word/2020/wordml/sdtdatahash" xmlns:w16sdtfl="http://schemas.microsoft.com/office/word/2024/wordml/sdtformatlock" xmlns:w16se="http://schemas.microsoft.com/office/word/2015/wordml/symex" xmlns:wpg="http://schemas.microsoft.com/office/word/2010/wordprocessingGroup" xmlns:wpi="http://schemas.microsoft.com/office/word/2010/wordprocessingInk" xmlns:wne="http://schemas.microsoft.com/office/word/2006/wordml" xmlns:wps="http://schemas.microsoft.com/office/word/2010/wordprocessingShape" mc:Ignorable="w14 w15 w16se w16cid w16 w16cex w16sdtdh w16sdtfl w16du wp14">
   <w:p>
     <w:pPr>
@@ -27949,7 +27893,7 @@
 </w:ftr>
 </file>
 
-<file path=word/footer5.xml><?xml version="1.0" encoding="utf-8"?>
+<file path=word/footer3.xml><?xml version="1.0" encoding="utf-8"?>
 <w:ftr xmlns:wpc="http://schemas.microsoft.com/office/word/2010/wordprocessingCanvas" xmlns:cx="http://schemas.microsoft.com/office/drawing/2014/chartex" xmlns:cx1="http://schemas.microsoft.com/office/drawing/2015/9/8/chartex" xmlns:cx2="http://schemas.microsoft.com/office/drawing/2015/10/21/chartex" xmlns:cx3="http://schemas.microsoft.com/office/drawing/2016/5/9/chartex" xmlns:cx4="http://schemas.microsoft.com/office/drawing/2016/5/10/chartex" xmlns:cx5="http://schemas.microsoft.com/office/drawing/2016/5/11/chartex" xmlns:cx6="http://schemas.microsoft.com/office/drawing/2016/5/12/chartex" xmlns:cx7="http://schemas.microsoft.com/office/drawing/2016/5/13/chartex" xmlns:cx8="http://schemas.microsoft.com/office/drawing/2016/5/14/chartex" xmlns:mc="http://schemas.openxmlformats.org/markup-compatibility/2006" xmlns:aink="http://schemas.microsoft.com/office/drawing/2016/ink" xmlns:am3d="http://schemas.microsoft.com/office/drawing/2017/model3d" xmlns:o="urn:schemas-microsoft-com:office:office" xmlns:oel="http://schemas.microsoft.com/office/2019/extlst" xmlns:r="http://schemas.openxmlformats.org/officeDocument/2006/relationships" xmlns:m="http://schemas.openxmlformats.org/officeDocument/2006/math" xmlns:v="urn:schemas-microsoft-com:vml" xmlns:wp14="http://schemas.microsoft.com/office/word/2010/wordprocessingDrawing" xmlns:wp="http://schemas.openxmlformats.org/drawingml/2006/wordprocessingDrawing" xmlns:w10="urn:schemas-microsoft-com:office:word" xmlns:w="http://schemas.openxmlformats.org/wordprocessingml/2006/main" xmlns:w14="http://schemas.microsoft.com/office/word/2010/wordml" xmlns:w15="http://schemas.microsoft.com/office/word/2012/wordml" xmlns:w16cex="http://schemas.microsoft.com/office/word/2018/wordml/cex" xmlns:w16cid="http://schemas.microsoft.com/office/word/2016/wordml/cid" xmlns:w16="http://schemas.microsoft.com/office/word/2018/wordml" xmlns:w16du="http://schemas.microsoft.com/office/word/2023/wordml/word16du" xmlns:w16sdtdh="http://schemas.microsoft.com/office/word/2020/wordml/sdtdatahash" xmlns:w16sdtfl="http://schemas.microsoft.com/office/word/2024/wordml/sdtformatlock" xmlns:w16se="http://schemas.microsoft.com/office/word/2015/wordml/symex" xmlns:wpg="http://schemas.microsoft.com/office/word/2010/wordprocessingGroup" xmlns:wpi="http://schemas.microsoft.com/office/word/2010/wordprocessingInk" xmlns:wne="http://schemas.microsoft.com/office/word/2006/wordml" xmlns:wps="http://schemas.microsoft.com/office/word/2010/wordprocessingShape" mc:Ignorable="w14 w15 w16se w16cid w16 w16cex w16sdtdh w16sdtfl w16du wp14">
   <w:tbl>
     <w:tblPr>
@@ -28129,7 +28073,7 @@
 </w:ftr>
 </file>
 
-<file path=word/footer6.xml><?xml version="1.0" encoding="utf-8"?>
+<file path=word/footer4.xml><?xml version="1.0" encoding="utf-8"?>
 <w:ftr xmlns:wpc="http://schemas.microsoft.com/office/word/2010/wordprocessingCanvas" xmlns:cx="http://schemas.microsoft.com/office/drawing/2014/chartex" xmlns:cx1="http://schemas.microsoft.com/office/drawing/2015/9/8/chartex" xmlns:cx2="http://schemas.microsoft.com/office/drawing/2015/10/21/chartex" xmlns:cx3="http://schemas.microsoft.com/office/drawing/2016/5/9/chartex" xmlns:cx4="http://schemas.microsoft.com/office/drawing/2016/5/10/chartex" xmlns:cx5="http://schemas.microsoft.com/office/drawing/2016/5/11/chartex" xmlns:cx6="http://schemas.microsoft.com/office/drawing/2016/5/12/chartex" xmlns:cx7="http://schemas.microsoft.com/office/drawing/2016/5/13/chartex" xmlns:cx8="http://schemas.microsoft.com/office/drawing/2016/5/14/chartex" xmlns:mc="http://schemas.openxmlformats.org/markup-compatibility/2006" xmlns:aink="http://schemas.microsoft.com/office/drawing/2016/ink" xmlns:am3d="http://schemas.microsoft.com/office/drawing/2017/model3d" xmlns:o="urn:schemas-microsoft-com:office:office" xmlns:oel="http://schemas.microsoft.com/office/2019/extlst" xmlns:r="http://schemas.openxmlformats.org/officeDocument/2006/relationships" xmlns:m="http://schemas.openxmlformats.org/officeDocument/2006/math" xmlns:v="urn:schemas-microsoft-com:vml" xmlns:wp14="http://schemas.microsoft.com/office/word/2010/wordprocessingDrawing" xmlns:wp="http://schemas.openxmlformats.org/drawingml/2006/wordprocessingDrawing" xmlns:w10="urn:schemas-microsoft-com:office:word" xmlns:w="http://schemas.openxmlformats.org/wordprocessingml/2006/main" xmlns:w14="http://schemas.microsoft.com/office/word/2010/wordml" xmlns:w15="http://schemas.microsoft.com/office/word/2012/wordml" xmlns:w16cex="http://schemas.microsoft.com/office/word/2018/wordml/cex" xmlns:w16cid="http://schemas.microsoft.com/office/word/2016/wordml/cid" xmlns:w16="http://schemas.microsoft.com/office/word/2018/wordml" xmlns:w16du="http://schemas.microsoft.com/office/word/2023/wordml/word16du" xmlns:w16sdtdh="http://schemas.microsoft.com/office/word/2020/wordml/sdtdatahash" xmlns:w16sdtfl="http://schemas.microsoft.com/office/word/2024/wordml/sdtformatlock" xmlns:w16se="http://schemas.microsoft.com/office/word/2015/wordml/symex" xmlns:wpg="http://schemas.microsoft.com/office/word/2010/wordprocessingGroup" xmlns:wpi="http://schemas.microsoft.com/office/word/2010/wordprocessingInk" xmlns:wne="http://schemas.microsoft.com/office/word/2006/wordml" xmlns:wps="http://schemas.microsoft.com/office/word/2010/wordprocessingShape" mc:Ignorable="w14 w15 w16se w16cid w16 w16cex w16sdtdh w16sdtfl w16du wp14">
   <w:p>
     <w:pPr>
@@ -28179,36 +28123,6 @@
 </file>
 
 <file path=word/header3.xml><?xml version="1.0" encoding="utf-8"?>
-<w:hdr xmlns:wpc="http://schemas.microsoft.com/office/word/2010/wordprocessingCanvas" xmlns:cx="http://schemas.microsoft.com/office/drawing/2014/chartex" xmlns:cx1="http://schemas.microsoft.com/office/drawing/2015/9/8/chartex" xmlns:cx2="http://schemas.microsoft.com/office/drawing/2015/10/21/chartex" xmlns:cx3="http://schemas.microsoft.com/office/drawing/2016/5/9/chartex" xmlns:cx4="http://schemas.microsoft.com/office/drawing/2016/5/10/chartex" xmlns:cx5="http://schemas.microsoft.com/office/drawing/2016/5/11/chartex" xmlns:cx6="http://schemas.microsoft.com/office/drawing/2016/5/12/chartex" xmlns:cx7="http://schemas.microsoft.com/office/drawing/2016/5/13/chartex" xmlns:cx8="http://schemas.microsoft.com/office/drawing/2016/5/14/chartex" xmlns:mc="http://schemas.openxmlformats.org/markup-compatibility/2006" xmlns:aink="http://schemas.microsoft.com/office/drawing/2016/ink" xmlns:am3d="http://schemas.microsoft.com/office/drawing/2017/model3d" xmlns:o="urn:schemas-microsoft-com:office:office" xmlns:oel="http://schemas.microsoft.com/office/2019/extlst" xmlns:r="http://schemas.openxmlformats.org/officeDocument/2006/relationships" xmlns:m="http://schemas.openxmlformats.org/officeDocument/2006/math" xmlns:v="urn:schemas-microsoft-com:vml" xmlns:wp14="http://schemas.microsoft.com/office/word/2010/wordprocessingDrawing" xmlns:wp="http://schemas.openxmlformats.org/drawingml/2006/wordprocessingDrawing" xmlns:w10="urn:schemas-microsoft-com:office:word" xmlns:w="http://schemas.openxmlformats.org/wordprocessingml/2006/main" xmlns:w14="http://schemas.microsoft.com/office/word/2010/wordml" xmlns:w15="http://schemas.microsoft.com/office/word/2012/wordml" xmlns:w16cex="http://schemas.microsoft.com/office/word/2018/wordml/cex" xmlns:w16cid="http://schemas.microsoft.com/office/word/2016/wordml/cid" xmlns:w16="http://schemas.microsoft.com/office/word/2018/wordml" xmlns:w16du="http://schemas.microsoft.com/office/word/2023/wordml/word16du" xmlns:w16sdtdh="http://schemas.microsoft.com/office/word/2020/wordml/sdtdatahash" xmlns:w16sdtfl="http://schemas.microsoft.com/office/word/2024/wordml/sdtformatlock" xmlns:w16se="http://schemas.microsoft.com/office/word/2015/wordml/symex" xmlns:wpg="http://schemas.microsoft.com/office/word/2010/wordprocessingGroup" xmlns:wpi="http://schemas.microsoft.com/office/word/2010/wordprocessingInk" xmlns:wne="http://schemas.microsoft.com/office/word/2006/wordml" xmlns:wps="http://schemas.microsoft.com/office/word/2010/wordprocessingShape" mc:Ignorable="w14 w15 w16se w16cid w16 w16cex w16sdtdh w16sdtfl w16du wp14">
-  <w:p>
-    <w:pPr>
-      <w:pStyle w:val="Header"/>
-    </w:pPr>
-  </w:p>
-</w:hdr>
-</file>
-
-<file path=word/header4.xml><?xml version="1.0" encoding="utf-8"?>
-<w:hdr xmlns:wpc="http://schemas.microsoft.com/office/word/2010/wordprocessingCanvas" xmlns:cx="http://schemas.microsoft.com/office/drawing/2014/chartex" xmlns:cx1="http://schemas.microsoft.com/office/drawing/2015/9/8/chartex" xmlns:cx2="http://schemas.microsoft.com/office/drawing/2015/10/21/chartex" xmlns:cx3="http://schemas.microsoft.com/office/drawing/2016/5/9/chartex" xmlns:cx4="http://schemas.microsoft.com/office/drawing/2016/5/10/chartex" xmlns:cx5="http://schemas.microsoft.com/office/drawing/2016/5/11/chartex" xmlns:cx6="http://schemas.microsoft.com/office/drawing/2016/5/12/chartex" xmlns:cx7="http://schemas.microsoft.com/office/drawing/2016/5/13/chartex" xmlns:cx8="http://schemas.microsoft.com/office/drawing/2016/5/14/chartex" xmlns:mc="http://schemas.openxmlformats.org/markup-compatibility/2006" xmlns:aink="http://schemas.microsoft.com/office/drawing/2016/ink" xmlns:am3d="http://schemas.microsoft.com/office/drawing/2017/model3d" xmlns:o="urn:schemas-microsoft-com:office:office" xmlns:oel="http://schemas.microsoft.com/office/2019/extlst" xmlns:r="http://schemas.openxmlformats.org/officeDocument/2006/relationships" xmlns:m="http://schemas.openxmlformats.org/officeDocument/2006/math" xmlns:v="urn:schemas-microsoft-com:vml" xmlns:wp14="http://schemas.microsoft.com/office/word/2010/wordprocessingDrawing" xmlns:wp="http://schemas.openxmlformats.org/drawingml/2006/wordprocessingDrawing" xmlns:w10="urn:schemas-microsoft-com:office:word" xmlns:w="http://schemas.openxmlformats.org/wordprocessingml/2006/main" xmlns:w14="http://schemas.microsoft.com/office/word/2010/wordml" xmlns:w15="http://schemas.microsoft.com/office/word/2012/wordml" xmlns:w16cex="http://schemas.microsoft.com/office/word/2018/wordml/cex" xmlns:w16cid="http://schemas.microsoft.com/office/word/2016/wordml/cid" xmlns:w16="http://schemas.microsoft.com/office/word/2018/wordml" xmlns:w16du="http://schemas.microsoft.com/office/word/2023/wordml/word16du" xmlns:w16sdtdh="http://schemas.microsoft.com/office/word/2020/wordml/sdtdatahash" xmlns:w16sdtfl="http://schemas.microsoft.com/office/word/2024/wordml/sdtformatlock" xmlns:w16se="http://schemas.microsoft.com/office/word/2015/wordml/symex" xmlns:wpg="http://schemas.microsoft.com/office/word/2010/wordprocessingGroup" xmlns:wpi="http://schemas.microsoft.com/office/word/2010/wordprocessingInk" xmlns:wne="http://schemas.microsoft.com/office/word/2006/wordml" xmlns:wps="http://schemas.microsoft.com/office/word/2010/wordprocessingShape" mc:Ignorable="w14 w15 w16se w16cid w16 w16cex w16sdtdh w16sdtfl w16du wp14">
-  <w:p>
-    <w:pPr>
-      <w:pStyle w:val="Header"/>
-    </w:pPr>
-  </w:p>
-</w:hdr>
-</file>
-
-<file path=word/header5.xml><?xml version="1.0" encoding="utf-8"?>
-<w:hdr xmlns:wpc="http://schemas.microsoft.com/office/word/2010/wordprocessingCanvas" xmlns:cx="http://schemas.microsoft.com/office/drawing/2014/chartex" xmlns:cx1="http://schemas.microsoft.com/office/drawing/2015/9/8/chartex" xmlns:cx2="http://schemas.microsoft.com/office/drawing/2015/10/21/chartex" xmlns:cx3="http://schemas.microsoft.com/office/drawing/2016/5/9/chartex" xmlns:cx4="http://schemas.microsoft.com/office/drawing/2016/5/10/chartex" xmlns:cx5="http://schemas.microsoft.com/office/drawing/2016/5/11/chartex" xmlns:cx6="http://schemas.microsoft.com/office/drawing/2016/5/12/chartex" xmlns:cx7="http://schemas.microsoft.com/office/drawing/2016/5/13/chartex" xmlns:cx8="http://schemas.microsoft.com/office/drawing/2016/5/14/chartex" xmlns:mc="http://schemas.openxmlformats.org/markup-compatibility/2006" xmlns:aink="http://schemas.microsoft.com/office/drawing/2016/ink" xmlns:am3d="http://schemas.microsoft.com/office/drawing/2017/model3d" xmlns:o="urn:schemas-microsoft-com:office:office" xmlns:oel="http://schemas.microsoft.com/office/2019/extlst" xmlns:r="http://schemas.openxmlformats.org/officeDocument/2006/relationships" xmlns:m="http://schemas.openxmlformats.org/officeDocument/2006/math" xmlns:v="urn:schemas-microsoft-com:vml" xmlns:wp14="http://schemas.microsoft.com/office/word/2010/wordprocessingDrawing" xmlns:wp="http://schemas.openxmlformats.org/drawingml/2006/wordprocessingDrawing" xmlns:w10="urn:schemas-microsoft-com:office:word" xmlns:w="http://schemas.openxmlformats.org/wordprocessingml/2006/main" xmlns:w14="http://schemas.microsoft.com/office/word/2010/wordml" xmlns:w15="http://schemas.microsoft.com/office/word/2012/wordml" xmlns:w16cex="http://schemas.microsoft.com/office/word/2018/wordml/cex" xmlns:w16cid="http://schemas.microsoft.com/office/word/2016/wordml/cid" xmlns:w16="http://schemas.microsoft.com/office/word/2018/wordml" xmlns:w16du="http://schemas.microsoft.com/office/word/2023/wordml/word16du" xmlns:w16sdtdh="http://schemas.microsoft.com/office/word/2020/wordml/sdtdatahash" xmlns:w16sdtfl="http://schemas.microsoft.com/office/word/2024/wordml/sdtformatlock" xmlns:w16se="http://schemas.microsoft.com/office/word/2015/wordml/symex" xmlns:wpg="http://schemas.microsoft.com/office/word/2010/wordprocessingGroup" xmlns:wpi="http://schemas.microsoft.com/office/word/2010/wordprocessingInk" xmlns:wne="http://schemas.microsoft.com/office/word/2006/wordml" xmlns:wps="http://schemas.microsoft.com/office/word/2010/wordprocessingShape" mc:Ignorable="w14 w15 w16se w16cid w16 w16cex w16sdtdh w16sdtfl w16du wp14">
-  <w:p>
-    <w:pPr>
-      <w:pStyle w:val="Header"/>
-    </w:pPr>
-  </w:p>
-</w:hdr>
-</file>
-
-<file path=word/header6.xml><?xml version="1.0" encoding="utf-8"?>
 <w:hdr xmlns:wpc="http://schemas.microsoft.com/office/word/2010/wordprocessingCanvas" xmlns:cx="http://schemas.microsoft.com/office/drawing/2014/chartex" xmlns:cx1="http://schemas.microsoft.com/office/drawing/2015/9/8/chartex" xmlns:cx2="http://schemas.microsoft.com/office/drawing/2015/10/21/chartex" xmlns:cx3="http://schemas.microsoft.com/office/drawing/2016/5/9/chartex" xmlns:cx4="http://schemas.microsoft.com/office/drawing/2016/5/10/chartex" xmlns:cx5="http://schemas.microsoft.com/office/drawing/2016/5/11/chartex" xmlns:cx6="http://schemas.microsoft.com/office/drawing/2016/5/12/chartex" xmlns:cx7="http://schemas.microsoft.com/office/drawing/2016/5/13/chartex" xmlns:cx8="http://schemas.microsoft.com/office/drawing/2016/5/14/chartex" xmlns:mc="http://schemas.openxmlformats.org/markup-compatibility/2006" xmlns:aink="http://schemas.microsoft.com/office/drawing/2016/ink" xmlns:am3d="http://schemas.microsoft.com/office/drawing/2017/model3d" xmlns:o="urn:schemas-microsoft-com:office:office" xmlns:oel="http://schemas.microsoft.com/office/2019/extlst" xmlns:r="http://schemas.openxmlformats.org/officeDocument/2006/relationships" xmlns:m="http://schemas.openxmlformats.org/officeDocument/2006/math" xmlns:v="urn:schemas-microsoft-com:vml" xmlns:wp14="http://schemas.microsoft.com/office/word/2010/wordprocessingDrawing" xmlns:wp="http://schemas.openxmlformats.org/drawingml/2006/wordprocessingDrawing" xmlns:w10="urn:schemas-microsoft-com:office:word" xmlns:w="http://schemas.openxmlformats.org/wordprocessingml/2006/main" xmlns:w14="http://schemas.microsoft.com/office/word/2010/wordml" xmlns:w15="http://schemas.microsoft.com/office/word/2012/wordml" xmlns:w16cex="http://schemas.microsoft.com/office/word/2018/wordml/cex" xmlns:w16cid="http://schemas.microsoft.com/office/word/2016/wordml/cid" xmlns:w16="http://schemas.microsoft.com/office/word/2018/wordml" xmlns:w16du="http://schemas.microsoft.com/office/word/2023/wordml/word16du" xmlns:w16sdtdh="http://schemas.microsoft.com/office/word/2020/wordml/sdtdatahash" xmlns:w16sdtfl="http://schemas.microsoft.com/office/word/2024/wordml/sdtformatlock" xmlns:w16se="http://schemas.microsoft.com/office/word/2015/wordml/symex" xmlns:wpg="http://schemas.microsoft.com/office/word/2010/wordprocessingGroup" xmlns:wpi="http://schemas.microsoft.com/office/word/2010/wordprocessingInk" xmlns:wne="http://schemas.microsoft.com/office/word/2006/wordml" xmlns:wps="http://schemas.microsoft.com/office/word/2010/wordprocessingShape" mc:Ignorable="w14 w15 w16se w16cid w16 w16cex w16sdtdh w16sdtfl w16du wp14">
   <w:p>
     <w:pPr>

</xml_diff>